<commit_message>
Add new EDA outputs and SQL scripts for revenue momentum analysis
- Introduced new CSV files for revenue momentum threshold sensitivity and segment opportunity ranking.
- Updated the top 20 account health summary with revised data.
- Added a new table for top 20 revenue momentum by segment.
- Included new visual assets for segment health and opportunity ranking.
- Enhanced the run_eda.py script to include new output tables.
- Created a new SQL script for account health analysis and revenue momentum calculations.
- Updated existing SQL scripts to incorporate new logic for revenue momentum and account health states.
</commit_message>
<xml_diff>
--- a/Shine_Case_3_Page_Memo.docx
+++ b/Shine_Case_3_Page_Memo.docx
@@ -30,7 +30,7 @@
           <w:color w:val="102A43"/>
           <w:sz w:val="40"/>
         </w:rPr>
-        <w:t>Shine’s best next-quarter bet is to replicate high-value BTP behavior</w:t>
+        <w:t>Segment rankings point to BTP and Plus—not one universal winner</w:t>
       </w:r>
     </w:p>
     <w:p>
@@ -274,7 +274,7 @@
                 <w:color w:val="008C8C"/>
                 <w:sz w:val="30"/>
               </w:rPr>
-              <w:t>95.1%</w:t>
+              <w:t>2.18×</w:t>
             </w:r>
           </w:p>
           <w:p>
@@ -290,7 +290,7 @@
                 <w:color w:val="5E6C76"/>
                 <w:sz w:val="15"/>
               </w:rPr>
-              <w:t>top-20 accounts Healthy</w:t>
+              <w:t>Plus representation in high value</w:t>
             </w:r>
           </w:p>
         </w:tc>
@@ -304,7 +304,7 @@
       <w:r>
         <w:drawing>
           <wp:inline xmlns:a="http://schemas.openxmlformats.org/drawingml/2006/main" xmlns:pic="http://schemas.openxmlformats.org/drawingml/2006/picture">
-            <wp:extent cx="6372000" cy="1179842"/>
+            <wp:extent cx="6372000" cy="1961675"/>
             <wp:docPr id="1" name="Picture 1"/>
             <wp:cNvGraphicFramePr>
               <a:graphicFrameLocks noChangeAspect="1"/>
@@ -313,7 +313,7 @@
               <a:graphicData uri="http://schemas.openxmlformats.org/drawingml/2006/picture">
                 <pic:pic>
                   <pic:nvPicPr>
-                    <pic:cNvPr id="0" name="concentration_20_70.png"/>
+                    <pic:cNvPr id="0" name="segment_opportunity_ranking.png"/>
                     <pic:cNvPicPr/>
                   </pic:nvPicPr>
                   <pic:blipFill>
@@ -325,7 +325,7 @@
                   <pic:spPr>
                     <a:xfrm>
                       <a:off x="0" y="0"/>
-                      <a:ext cx="6372000" cy="1179842"/>
+                      <a:ext cx="6372000" cy="1961675"/>
                     </a:xfrm>
                     <a:prstGeom prst="rect"/>
                   </pic:spPr>
@@ -457,7 +457,7 @@
                 <w:color w:val="17212B"/>
                 <w:sz w:val="17"/>
               </w:rPr>
-              <w:t>BTP is 26.51% of the comparable top 20% and 30.28% of its revenue.</w:t>
+              <w:t>BTP leads scalable persona value: 30.28% of high-value revenue and 1.47× represented.</w:t>
             </w:r>
           </w:p>
           <w:p>
@@ -472,7 +472,7 @@
                 <w:color w:val="17212B"/>
                 <w:sz w:val="16"/>
               </w:rPr>
-              <w:t>Plus is 2.18× overrepresented; BTP + Plus is 2.44× represented.</w:t>
+              <w:t>Plus combines scale with efficiency: 33.42% of high-value revenue and 2.18× represented.</w:t>
             </w:r>
           </w:p>
         </w:tc>
@@ -515,7 +515,7 @@
                 <w:color w:val="17212B"/>
                 <w:sz w:val="17"/>
               </w:rPr>
-              <w:t>70.7% of April revenue comes from interchange and deposit interest.</w:t>
+              <w:t>Business is 3.55× represented but has only 196 comparable companies.</w:t>
             </w:r>
           </w:p>
           <w:p>
@@ -530,7 +530,7 @@
                 <w:color w:val="17212B"/>
                 <w:sz w:val="16"/>
               </w:rPr>
-              <w:t>The raw top 20% generates ~80% of both streams, creating usage and balance dependence.</w:t>
+              <w:t>Start contributes the most high-value revenue (39.70%) but is proportional at 0.97×; scale and efficiency are different.</w:t>
             </w:r>
           </w:p>
         </w:tc>
@@ -549,7 +549,7 @@
           <w:color w:val="102A43"/>
           <w:sz w:val="21"/>
         </w:rPr>
-        <w:t>Definitions and assumptions</w:t>
+        <w:t>How to read the ranking</w:t>
       </w:r>
     </w:p>
     <w:tbl>
@@ -593,7 +593,7 @@
                 <w:color w:val="102A43"/>
                 <w:sz w:val="15"/>
               </w:rPr>
-              <w:t xml:space="preserve">Revenue-active: </w:t>
+              <w:t xml:space="preserve">Bar length: </w:t>
             </w:r>
             <w:r>
               <w:rPr>
@@ -603,7 +603,7 @@
                 <w:color w:val="5E6C76"/>
                 <w:sz w:val="15"/>
               </w:rPr>
-              <w:t>revenue row in the observation month</w:t>
+              <w:t>share of all high-value revenue; this captures absolute scale</w:t>
             </w:r>
           </w:p>
         </w:tc>
@@ -629,7 +629,7 @@
                 <w:color w:val="102A43"/>
                 <w:sz w:val="15"/>
               </w:rPr>
-              <w:t xml:space="preserve">Healthy revenue account: </w:t>
+              <w:t xml:space="preserve">Bar color: </w:t>
             </w:r>
             <w:r>
               <w:rPr>
@@ -639,7 +639,7 @@
                 <w:color w:val="5E6C76"/>
                 <w:sz w:val="15"/>
               </w:rPr>
-              <w:t>Active with an unbroken revenue streak since activation</w:t>
+              <w:t>representation versus base; teal means at least 1.2×</w:t>
             </w:r>
           </w:p>
         </w:tc>
@@ -667,7 +667,7 @@
                 <w:color w:val="102A43"/>
                 <w:sz w:val="15"/>
               </w:rPr>
-              <w:t xml:space="preserve">At-risk: </w:t>
+              <w:t xml:space="preserve">N: </w:t>
             </w:r>
             <w:r>
               <w:rPr>
@@ -677,7 +677,7 @@
                 <w:color w:val="5E6C76"/>
                 <w:sz w:val="15"/>
               </w:rPr>
-              <w:t>previously Active, then 1–2 missing revenue months</w:t>
+              <w:t>eligible companies with three complete post-activation months</w:t>
             </w:r>
           </w:p>
         </w:tc>
@@ -703,7 +703,7 @@
                 <w:color w:val="102A43"/>
                 <w:sz w:val="15"/>
               </w:rPr>
-              <w:t xml:space="preserve">Churned proxy: </w:t>
+              <w:t xml:space="preserve">No composite score: </w:t>
             </w:r>
             <w:r>
               <w:rPr>
@@ -713,7 +713,7 @@
                 <w:color w:val="5E6C76"/>
                 <w:sz w:val="15"/>
               </w:rPr>
-              <w:t>previously Active, then ≥3 missing months; not confirmed churn</w:t>
+              <w:t>leadership can see the scale-efficiency trade-off directly</w:t>
             </w:r>
           </w:p>
         </w:tc>
@@ -741,7 +741,7 @@
           <w:color w:val="17212B"/>
           <w:sz w:val="18"/>
         </w:rPr>
-        <w:t>prioritize a controlled BTP adoption test; protect high-value companies at their first revenue gap. This is a concentrated growth opportunity—not evidence of a broad churn crisis.</w:t>
+        <w:t>prioritize a controlled BTP adoption test, with Plus as the strongest plan signal. Do not mistake Business efficiency or Start scale for a complete recommendation on its own.</w:t>
       </w:r>
     </w:p>
     <w:p>
@@ -820,10 +820,10 @@
           <w:tcPr>
             <w:tcW w:type="dxa" w:w="2622"/>
             <w:tcMar>
-              <w:top w:w="100" w:type="dxa"/>
-              <w:start w:w="105" w:type="dxa"/>
-              <w:bottom w:w="100" w:type="dxa"/>
-              <w:end w:w="105" w:type="dxa"/>
+              <w:top w:w="72" w:type="dxa"/>
+              <w:start w:w="95" w:type="dxa"/>
+              <w:bottom w:w="72" w:type="dxa"/>
+              <w:end w:w="95" w:type="dxa"/>
             </w:tcMar>
             <w:vAlign w:val="center"/>
             <w:shd w:fill="008C8C"/>
@@ -848,10 +848,10 @@
           <w:tcPr>
             <w:tcW w:type="dxa" w:w="2622"/>
             <w:tcMar>
-              <w:top w:w="100" w:type="dxa"/>
-              <w:start w:w="105" w:type="dxa"/>
-              <w:bottom w:w="100" w:type="dxa"/>
-              <w:end w:w="105" w:type="dxa"/>
+              <w:top w:w="72" w:type="dxa"/>
+              <w:start w:w="95" w:type="dxa"/>
+              <w:bottom w:w="72" w:type="dxa"/>
+              <w:end w:w="95" w:type="dxa"/>
             </w:tcMar>
             <w:vAlign w:val="center"/>
             <w:shd w:fill="EAF4F4"/>
@@ -891,10 +891,10 @@
           <w:tcPr>
             <w:tcW w:type="dxa" w:w="2622"/>
             <w:tcMar>
-              <w:top w:w="100" w:type="dxa"/>
-              <w:start w:w="105" w:type="dxa"/>
-              <w:bottom w:w="100" w:type="dxa"/>
-              <w:end w:w="105" w:type="dxa"/>
+              <w:top w:w="72" w:type="dxa"/>
+              <w:start w:w="95" w:type="dxa"/>
+              <w:bottom w:w="72" w:type="dxa"/>
+              <w:end w:w="95" w:type="dxa"/>
             </w:tcMar>
             <w:vAlign w:val="center"/>
           </w:tcPr>
@@ -925,7 +925,7 @@
                 <w:color w:val="17212B"/>
                 <w:sz w:val="16"/>
               </w:rPr>
-              <w:t>1,642 comparable BTP companies; 482 already top 20%, leaving 1,160 outside. BTP contributes €233.6k / 30.28% of top-20 revenue across the first three complete months.</w:t>
+              <w:t>BTP contributes 30.28% of high-value revenue (N=1,642; 1.47×). In the mature BTP base (N=1,151), 71.07% are Healthy and 15.55% Watch.</w:t>
             </w:r>
           </w:p>
         </w:tc>
@@ -933,10 +933,10 @@
           <w:tcPr>
             <w:tcW w:type="dxa" w:w="2622"/>
             <w:tcMar>
-              <w:top w:w="100" w:type="dxa"/>
-              <w:start w:w="105" w:type="dxa"/>
-              <w:bottom w:w="100" w:type="dxa"/>
-              <w:end w:w="105" w:type="dxa"/>
+              <w:top w:w="72" w:type="dxa"/>
+              <w:start w:w="95" w:type="dxa"/>
+              <w:bottom w:w="72" w:type="dxa"/>
+              <w:end w:w="95" w:type="dxa"/>
             </w:tcMar>
             <w:vAlign w:val="center"/>
           </w:tcPr>
@@ -1003,10 +1003,10 @@
           <w:tcPr>
             <w:tcW w:type="dxa" w:w="2622"/>
             <w:tcMar>
-              <w:top w:w="100" w:type="dxa"/>
-              <w:start w:w="105" w:type="dxa"/>
-              <w:bottom w:w="100" w:type="dxa"/>
-              <w:end w:w="105" w:type="dxa"/>
+              <w:top w:w="72" w:type="dxa"/>
+              <w:start w:w="95" w:type="dxa"/>
+              <w:bottom w:w="72" w:type="dxa"/>
+              <w:end w:w="95" w:type="dxa"/>
             </w:tcMar>
             <w:vAlign w:val="center"/>
             <w:shd w:fill="E9A23B"/>
@@ -1031,10 +1031,10 @@
           <w:tcPr>
             <w:tcW w:type="dxa" w:w="2622"/>
             <w:tcMar>
-              <w:top w:w="100" w:type="dxa"/>
-              <w:start w:w="105" w:type="dxa"/>
-              <w:bottom w:w="100" w:type="dxa"/>
-              <w:end w:w="105" w:type="dxa"/>
+              <w:top w:w="72" w:type="dxa"/>
+              <w:start w:w="95" w:type="dxa"/>
+              <w:bottom w:w="72" w:type="dxa"/>
+              <w:end w:w="95" w:type="dxa"/>
             </w:tcMar>
             <w:vAlign w:val="center"/>
             <w:shd w:fill="F3F5F7"/>
@@ -1051,7 +1051,7 @@
                 <w:color w:val="102A43"/>
                 <w:sz w:val="18"/>
               </w:rPr>
-              <w:t>First-gap protection for high-value companies</w:t>
+              <w:t>Revenue-decline &amp; first-gap protection</w:t>
             </w:r>
           </w:p>
           <w:p>
@@ -1066,7 +1066,7 @@
                 <w:color w:val="5E6C76"/>
                 <w:sz w:val="15"/>
               </w:rPr>
-              <w:t>Trigger support after the first missing revenue month; keep recovered companies monitored.</w:t>
+              <w:t>Trigger diagnosis at a material revenue decline and support after the first missing month; monitor recoveries.</w:t>
             </w:r>
           </w:p>
         </w:tc>
@@ -1074,10 +1074,10 @@
           <w:tcPr>
             <w:tcW w:type="dxa" w:w="2622"/>
             <w:tcMar>
-              <w:top w:w="100" w:type="dxa"/>
-              <w:start w:w="105" w:type="dxa"/>
-              <w:bottom w:w="100" w:type="dxa"/>
-              <w:end w:w="105" w:type="dxa"/>
+              <w:top w:w="72" w:type="dxa"/>
+              <w:start w:w="95" w:type="dxa"/>
+              <w:bottom w:w="72" w:type="dxa"/>
+              <w:end w:w="95" w:type="dxa"/>
             </w:tcMar>
             <w:vAlign w:val="center"/>
           </w:tcPr>
@@ -1108,7 +1108,7 @@
                 <w:color w:val="17212B"/>
                 <w:sz w:val="16"/>
               </w:rPr>
-              <w:t>85 top-20 companies At-risk + 69 Churned proxy. Last-observed monthly revenue exposure: €19.24k. Healthy / recovered pool generates ~€424k in April.</w:t>
+              <w:t>493 high-value accounts are Watch, with a €41.0k observed baseline-to-April gap. In the mature base, Business is only 46.15% Healthy and 43.36% inactive—but N=143.</w:t>
             </w:r>
           </w:p>
         </w:tc>
@@ -1116,10 +1116,10 @@
           <w:tcPr>
             <w:tcW w:type="dxa" w:w="2622"/>
             <w:tcMar>
-              <w:top w:w="100" w:type="dxa"/>
-              <w:start w:w="105" w:type="dxa"/>
-              <w:bottom w:w="100" w:type="dxa"/>
-              <w:end w:w="105" w:type="dxa"/>
+              <w:top w:w="72" w:type="dxa"/>
+              <w:start w:w="95" w:type="dxa"/>
+              <w:bottom w:w="72" w:type="dxa"/>
+              <w:end w:w="95" w:type="dxa"/>
             </w:tcMar>
             <w:vAlign w:val="center"/>
           </w:tcPr>
@@ -1150,7 +1150,7 @@
                 <w:color w:val="17212B"/>
                 <w:sz w:val="16"/>
               </w:rPr>
-              <w:t>The current eligible risk pool is small and may require a phased rollout or broader pre-defined high-value band.</w:t>
+              <w:t>The decline threshold is an analytical assumption, not causal loss. Product usage is missing, so diagnose the driver before outreach.</w:t>
             </w:r>
           </w:p>
         </w:tc>
@@ -1174,7 +1174,7 @@
           <w:color w:val="102A43"/>
           <w:sz w:val="21"/>
         </w:rPr>
-        <w:t>Why blanket churn is not the lead bet</w:t>
+        <w:t>Health by segment: activated by Dec 2025 (N=6,337)</w:t>
       </w:r>
     </w:p>
     <w:p>
@@ -1185,7 +1185,7 @@
       <w:r>
         <w:drawing>
           <wp:inline xmlns:a="http://schemas.openxmlformats.org/drawingml/2006/main" xmlns:pic="http://schemas.openxmlformats.org/drawingml/2006/picture">
-            <wp:extent cx="6263999" cy="1425661"/>
+            <wp:extent cx="5580000" cy="2293151"/>
             <wp:docPr id="2" name="Picture 2"/>
             <wp:cNvGraphicFramePr>
               <a:graphicFrameLocks noChangeAspect="1"/>
@@ -1194,7 +1194,7 @@
               <a:graphicData uri="http://schemas.openxmlformats.org/drawingml/2006/picture">
                 <pic:pic>
                   <pic:nvPicPr>
-                    <pic:cNvPr id="0" name="top20_health.png"/>
+                    <pic:cNvPr id="0" name="segment_health_stacked.png"/>
                     <pic:cNvPicPr/>
                   </pic:nvPicPr>
                   <pic:blipFill>
@@ -1206,7 +1206,7 @@
                   <pic:spPr>
                     <a:xfrm>
                       <a:off x="0" y="0"/>
-                      <a:ext cx="6263999" cy="1425661"/>
+                      <a:ext cx="5580000" cy="2293151"/>
                     </a:xfrm>
                     <a:prstGeom prst="rect"/>
                   </pic:spPr>
@@ -1346,10 +1346,10 @@
           <w:tcPr>
             <w:tcW w:type="dxa" w:w="2268"/>
             <w:tcMar>
-              <w:top w:w="65" w:type="dxa"/>
-              <w:start w:w="90" w:type="dxa"/>
-              <w:bottom w:w="65" w:type="dxa"/>
-              <w:end w:w="90" w:type="dxa"/>
+              <w:top w:w="45" w:type="dxa"/>
+              <w:start w:w="80" w:type="dxa"/>
+              <w:bottom w:w="45" w:type="dxa"/>
+              <w:end w:w="80" w:type="dxa"/>
             </w:tcMar>
             <w:shd w:fill="F3F5F7"/>
           </w:tcPr>
@@ -1363,7 +1363,7 @@
                 <w:b/>
                 <w:i w:val="0"/>
                 <w:color w:val="102A43"/>
-                <w:sz w:val="15"/>
+                <w:sz w:val="14"/>
               </w:rPr>
               <w:t>Acquire more Business</w:t>
             </w:r>
@@ -1373,10 +1373,10 @@
           <w:tcPr>
             <w:tcW w:type="dxa" w:w="2324"/>
             <w:tcMar>
-              <w:top w:w="65" w:type="dxa"/>
-              <w:start w:w="90" w:type="dxa"/>
-              <w:bottom w:w="65" w:type="dxa"/>
-              <w:end w:w="90" w:type="dxa"/>
+              <w:top w:w="45" w:type="dxa"/>
+              <w:start w:w="80" w:type="dxa"/>
+              <w:bottom w:w="45" w:type="dxa"/>
+              <w:end w:w="80" w:type="dxa"/>
             </w:tcMar>
             <w:shd w:fill="F3F5F7"/>
           </w:tcPr>
@@ -1390,7 +1390,7 @@
                 <w:b w:val="0"/>
                 <w:i w:val="0"/>
                 <w:color w:val="17212B"/>
-                <w:sz w:val="15"/>
+                <w:sz w:val="14"/>
               </w:rPr>
               <w:t>High revenue/company</w:t>
             </w:r>
@@ -1400,10 +1400,10 @@
           <w:tcPr>
             <w:tcW w:type="dxa" w:w="5783"/>
             <w:tcMar>
-              <w:top w:w="65" w:type="dxa"/>
-              <w:start w:w="90" w:type="dxa"/>
-              <w:bottom w:w="65" w:type="dxa"/>
-              <w:end w:w="90" w:type="dxa"/>
+              <w:top w:w="45" w:type="dxa"/>
+              <w:start w:w="80" w:type="dxa"/>
+              <w:bottom w:w="45" w:type="dxa"/>
+              <w:end w:w="80" w:type="dxa"/>
             </w:tcMar>
             <w:shd w:fill="F3F5F7"/>
           </w:tcPr>
@@ -1417,7 +1417,7 @@
                 <w:b w:val="0"/>
                 <w:i w:val="0"/>
                 <w:color w:val="17212B"/>
-                <w:sz w:val="15"/>
+                <w:sz w:val="14"/>
               </w:rPr>
               <w:t>Small base; 73.3% funnel dropout; weak continuity; no CAC or KYB-reason data.</w:t>
             </w:r>
@@ -1432,10 +1432,10 @@
           <w:tcPr>
             <w:tcW w:type="dxa" w:w="2268"/>
             <w:tcMar>
-              <w:top w:w="65" w:type="dxa"/>
-              <w:start w:w="90" w:type="dxa"/>
-              <w:bottom w:w="65" w:type="dxa"/>
-              <w:end w:w="90" w:type="dxa"/>
+              <w:top w:w="45" w:type="dxa"/>
+              <w:start w:w="80" w:type="dxa"/>
+              <w:bottom w:w="45" w:type="dxa"/>
+              <w:end w:w="80" w:type="dxa"/>
             </w:tcMar>
             <w:shd w:fill="FFFFFF"/>
           </w:tcPr>
@@ -1449,7 +1449,7 @@
                 <w:b/>
                 <w:i w:val="0"/>
                 <w:color w:val="102A43"/>
-                <w:sz w:val="15"/>
+                <w:sz w:val="14"/>
               </w:rPr>
               <w:t>Broad funnel overhaul</w:t>
             </w:r>
@@ -1459,10 +1459,10 @@
           <w:tcPr>
             <w:tcW w:type="dxa" w:w="2324"/>
             <w:tcMar>
-              <w:top w:w="65" w:type="dxa"/>
-              <w:start w:w="90" w:type="dxa"/>
-              <w:bottom w:w="65" w:type="dxa"/>
-              <w:end w:w="90" w:type="dxa"/>
+              <w:top w:w="45" w:type="dxa"/>
+              <w:start w:w="80" w:type="dxa"/>
+              <w:bottom w:w="45" w:type="dxa"/>
+              <w:end w:w="80" w:type="dxa"/>
             </w:tcMar>
             <w:shd w:fill="FFFFFF"/>
           </w:tcPr>
@@ -1476,7 +1476,7 @@
                 <w:b w:val="0"/>
                 <w:i w:val="0"/>
                 <w:color w:val="17212B"/>
-                <w:sz w:val="15"/>
+                <w:sz w:val="14"/>
               </w:rPr>
               <w:t>62.9% 30-day dropout</w:t>
             </w:r>
@@ -1486,10 +1486,10 @@
           <w:tcPr>
             <w:tcW w:type="dxa" w:w="5783"/>
             <w:tcMar>
-              <w:top w:w="65" w:type="dxa"/>
-              <w:start w:w="90" w:type="dxa"/>
-              <w:bottom w:w="65" w:type="dxa"/>
-              <w:end w:w="90" w:type="dxa"/>
+              <w:top w:w="45" w:type="dxa"/>
+              <w:start w:w="80" w:type="dxa"/>
+              <w:bottom w:w="45" w:type="dxa"/>
+              <w:end w:w="80" w:type="dxa"/>
             </w:tcMar>
             <w:shd w:fill="FFFFFF"/>
           </w:tcPr>
@@ -1503,7 +1503,7 @@
                 <w:b w:val="0"/>
                 <w:i w:val="0"/>
                 <w:color w:val="17212B"/>
-                <w:sz w:val="15"/>
+                <w:sz w:val="14"/>
               </w:rPr>
               <w:t>Cannot distinguish rejection, delay, abandonment, or extraction effects; no channel cost.</w:t>
             </w:r>
@@ -1518,10 +1518,10 @@
           <w:tcPr>
             <w:tcW w:type="dxa" w:w="2268"/>
             <w:tcMar>
-              <w:top w:w="65" w:type="dxa"/>
-              <w:start w:w="90" w:type="dxa"/>
-              <w:bottom w:w="65" w:type="dxa"/>
-              <w:end w:w="90" w:type="dxa"/>
+              <w:top w:w="45" w:type="dxa"/>
+              <w:start w:w="80" w:type="dxa"/>
+              <w:bottom w:w="45" w:type="dxa"/>
+              <w:end w:w="80" w:type="dxa"/>
             </w:tcMar>
             <w:shd w:fill="F3F5F7"/>
           </w:tcPr>
@@ -1535,7 +1535,7 @@
                 <w:b/>
                 <w:i w:val="0"/>
                 <w:color w:val="102A43"/>
-                <w:sz w:val="15"/>
+                <w:sz w:val="14"/>
               </w:rPr>
               <w:t>Blanket churn campaign</w:t>
             </w:r>
@@ -1545,10 +1545,10 @@
           <w:tcPr>
             <w:tcW w:type="dxa" w:w="2324"/>
             <w:tcMar>
-              <w:top w:w="65" w:type="dxa"/>
-              <w:start w:w="90" w:type="dxa"/>
-              <w:bottom w:w="65" w:type="dxa"/>
-              <w:end w:w="90" w:type="dxa"/>
+              <w:top w:w="45" w:type="dxa"/>
+              <w:start w:w="80" w:type="dxa"/>
+              <w:bottom w:w="45" w:type="dxa"/>
+              <w:end w:w="80" w:type="dxa"/>
             </w:tcMar>
             <w:shd w:fill="F3F5F7"/>
           </w:tcPr>
@@ -1562,7 +1562,7 @@
                 <w:b w:val="0"/>
                 <w:i w:val="0"/>
                 <w:color w:val="17212B"/>
-                <w:sz w:val="15"/>
+                <w:sz w:val="14"/>
               </w:rPr>
               <w:t>Retention feels urgent</w:t>
             </w:r>
@@ -1572,10 +1572,10 @@
           <w:tcPr>
             <w:tcW w:type="dxa" w:w="5783"/>
             <w:tcMar>
-              <w:top w:w="65" w:type="dxa"/>
-              <w:start w:w="90" w:type="dxa"/>
-              <w:bottom w:w="65" w:type="dxa"/>
-              <w:end w:w="90" w:type="dxa"/>
+              <w:top w:w="45" w:type="dxa"/>
+              <w:start w:w="80" w:type="dxa"/>
+              <w:bottom w:w="45" w:type="dxa"/>
+              <w:end w:w="80" w:type="dxa"/>
             </w:tcMar>
             <w:shd w:fill="F3F5F7"/>
           </w:tcPr>
@@ -1589,9 +1589,9 @@
                 <w:b w:val="0"/>
                 <w:i w:val="0"/>
                 <w:color w:val="17212B"/>
-                <w:sz w:val="15"/>
+                <w:sz w:val="14"/>
               </w:rPr>
-              <w:t>High-value pool is 95.08% Healthy; target the first gap instead.</w:t>
+              <w:t>A decline is not churn; target the 493 Watch and 154 inactive accounts with distinct treatments.</w:t>
             </w:r>
           </w:p>
         </w:tc>
@@ -1604,10 +1604,10 @@
           <w:tcPr>
             <w:tcW w:type="dxa" w:w="2268"/>
             <w:tcMar>
-              <w:top w:w="65" w:type="dxa"/>
-              <w:start w:w="90" w:type="dxa"/>
-              <w:bottom w:w="65" w:type="dxa"/>
-              <w:end w:w="90" w:type="dxa"/>
+              <w:top w:w="45" w:type="dxa"/>
+              <w:start w:w="80" w:type="dxa"/>
+              <w:bottom w:w="45" w:type="dxa"/>
+              <w:end w:w="80" w:type="dxa"/>
             </w:tcMar>
             <w:shd w:fill="FFFFFF"/>
           </w:tcPr>
@@ -1621,7 +1621,7 @@
                 <w:b/>
                 <w:i w:val="0"/>
                 <w:color w:val="102A43"/>
-                <w:sz w:val="15"/>
+                <w:sz w:val="14"/>
               </w:rPr>
               <w:t>Immediate plan upsell</w:t>
             </w:r>
@@ -1631,10 +1631,10 @@
           <w:tcPr>
             <w:tcW w:type="dxa" w:w="2324"/>
             <w:tcMar>
-              <w:top w:w="65" w:type="dxa"/>
-              <w:start w:w="90" w:type="dxa"/>
-              <w:bottom w:w="65" w:type="dxa"/>
-              <w:end w:w="90" w:type="dxa"/>
+              <w:top w:w="45" w:type="dxa"/>
+              <w:start w:w="80" w:type="dxa"/>
+              <w:bottom w:w="45" w:type="dxa"/>
+              <w:end w:w="80" w:type="dxa"/>
             </w:tcMar>
             <w:shd w:fill="FFFFFF"/>
           </w:tcPr>
@@ -1648,7 +1648,7 @@
                 <w:b w:val="0"/>
                 <w:i w:val="0"/>
                 <w:color w:val="17212B"/>
-                <w:sz w:val="15"/>
+                <w:sz w:val="14"/>
               </w:rPr>
               <w:t>Plus/Business correlate with value</w:t>
             </w:r>
@@ -1658,10 +1658,10 @@
           <w:tcPr>
             <w:tcW w:type="dxa" w:w="5783"/>
             <w:tcMar>
-              <w:top w:w="65" w:type="dxa"/>
-              <w:start w:w="90" w:type="dxa"/>
-              <w:bottom w:w="65" w:type="dxa"/>
-              <w:end w:w="90" w:type="dxa"/>
+              <w:top w:w="45" w:type="dxa"/>
+              <w:start w:w="80" w:type="dxa"/>
+              <w:bottom w:w="45" w:type="dxa"/>
+              <w:end w:w="80" w:type="dxa"/>
             </w:tcMar>
             <w:shd w:fill="FFFFFF"/>
           </w:tcPr>
@@ -1675,7 +1675,7 @@
                 <w:b w:val="0"/>
                 <w:i w:val="0"/>
                 <w:color w:val="17212B"/>
-                <w:sz w:val="15"/>
+                <w:sz w:val="14"/>
               </w:rPr>
               <w:t>Only initial plan exists; current plan and causal plan effect are unknown.</w:t>
             </w:r>
@@ -1685,33 +1685,27 @@
     </w:tbl>
     <w:p>
       <w:pPr>
-        <w:keepNext/>
-        <w:spacing w:before="60" w:after="60"/>
+        <w:spacing w:before="40" w:after="0"/>
       </w:pPr>
       <w:r>
         <w:rPr>
           <w:rFonts w:ascii="Arial" w:hAnsi="Arial"/>
           <w:b/>
           <w:i w:val="0"/>
-          <w:color w:val="102A43"/>
-          <w:sz w:val="21"/>
+          <w:color w:val="C95C3D"/>
+          <w:sz w:val="15"/>
         </w:rPr>
-        <w:t>Magnitude: honest bounds</w:t>
+        <w:t xml:space="preserve">Magnitude limit: </w:t>
       </w:r>
-    </w:p>
-    <w:p>
-      <w:pPr>
-        <w:spacing w:after="0" w:line="250" w:lineRule="auto"/>
-      </w:pPr>
       <w:r>
         <w:rPr>
           <w:rFonts w:ascii="Arial" w:hAnsi="Arial"/>
           <w:b w:val="0"/>
           <w:i w:val="0"/>
-          <w:color w:val="17212B"/>
-          <w:sz w:val="17"/>
+          <w:color w:val="5E6C76"/>
+          <w:sz w:val="15"/>
         </w:rPr>
-        <w:t>We can size populations and observed revenue, not incremental uplift. The dataset lacks product usage, current plan, treatment cost, margin, CAC, and a causal counterfactual. Rank 1 has the larger addressable pool; Rank 2 protects a smaller currently exposed pool.</w:t>
+        <w:t>populations and observed revenue can be sized; uplift, margin, CAC and causal impact cannot.</w:t>
       </w:r>
     </w:p>
     <w:p>
@@ -2654,7 +2648,7 @@
           <w:color w:val="5E6C76"/>
           <w:sz w:val="15"/>
         </w:rPr>
-        <w:t>sql/revenue_concentration_analysis.sql • sql/presentation_kpis.sql • sql/kpi_deep_dive.sql</w:t>
+        <w:t>sql/revenue_concentration_analysis.sql • sql/presentation_kpis.sql • sql/account_health_playground.sql</w:t>
       </w:r>
     </w:p>
     <w:p>

</xml_diff>

<commit_message>
Update documentation and SQL scripts for enhanced analysis and reporting
</commit_message>
<xml_diff>
--- a/Shine_Case_3_Page_Memo.docx
+++ b/Shine_Case_3_Page_Memo.docx
@@ -82,7 +82,7 @@
                 <w:color w:val="FFFFFF"/>
                 <w:sz w:val="22"/>
               </w:rPr>
-              <w:t>Across the first three complete calendar months after activation, the highest-revenue 20% of companies generate 70% of revenue. BTP contributes 30% of that value and is the clearest scalable opportunity.</w:t>
+              <w:t>Across all 9,088 comparable companies, BTP contributes 26.74% of revenue and Start 44.64% by plan; Plus generates 2.02× average revenue per company. Separately, the top 20% generates 70.24%—a concentration signal, not the segment-ranking basis.</w:t>
             </w:r>
           </w:p>
         </w:tc>
@@ -139,7 +139,7 @@
                 <w:color w:val="008C8C"/>
                 <w:sz w:val="30"/>
               </w:rPr>
-              <w:t>20%</w:t>
+              <w:t>9,088</w:t>
             </w:r>
           </w:p>
           <w:p>
@@ -155,7 +155,97 @@
                 <w:color w:val="5E6C76"/>
                 <w:sz w:val="15"/>
               </w:rPr>
-              <w:t>highest-revenue companies</w:t>
+              <w:t>companies in comparable base</w:t>
+            </w:r>
+          </w:p>
+        </w:tc>
+        <w:tc>
+          <w:tcPr>
+            <w:tcW w:type="dxa" w:w="2622"/>
+            <w:shd w:fill="EAF4F4"/>
+            <w:tcMar>
+              <w:top w:w="90" w:type="dxa"/>
+              <w:start w:w="65" w:type="dxa"/>
+              <w:bottom w:w="90" w:type="dxa"/>
+              <w:end w:w="65" w:type="dxa"/>
+            </w:tcMar>
+            <w:vAlign w:val="center"/>
+          </w:tcPr>
+          <w:p>
+            <w:pPr>
+              <w:spacing w:after="0"/>
+              <w:jc w:val="center"/>
+            </w:pPr>
+            <w:r>
+              <w:rPr>
+                <w:rFonts w:ascii="Arial" w:hAnsi="Arial"/>
+                <w:b/>
+                <w:i w:val="0"/>
+                <w:color w:val="008C8C"/>
+                <w:sz w:val="30"/>
+              </w:rPr>
+              <w:t>44.6%</w:t>
+            </w:r>
+          </w:p>
+          <w:p>
+            <w:pPr>
+              <w:spacing w:after="0"/>
+              <w:jc w:val="center"/>
+            </w:pPr>
+            <w:r>
+              <w:rPr>
+                <w:rFonts w:ascii="Arial" w:hAnsi="Arial"/>
+                <w:b w:val="0"/>
+                <w:i w:val="0"/>
+                <w:color w:val="5E6C76"/>
+                <w:sz w:val="15"/>
+              </w:rPr>
+              <w:t>all comparable revenue from Start</w:t>
+            </w:r>
+          </w:p>
+        </w:tc>
+        <w:tc>
+          <w:tcPr>
+            <w:tcW w:type="dxa" w:w="2622"/>
+            <w:shd w:fill="F3F5F7"/>
+            <w:tcMar>
+              <w:top w:w="90" w:type="dxa"/>
+              <w:start w:w="65" w:type="dxa"/>
+              <w:bottom w:w="90" w:type="dxa"/>
+              <w:end w:w="65" w:type="dxa"/>
+            </w:tcMar>
+            <w:vAlign w:val="center"/>
+          </w:tcPr>
+          <w:p>
+            <w:pPr>
+              <w:spacing w:after="0"/>
+              <w:jc w:val="center"/>
+            </w:pPr>
+            <w:r>
+              <w:rPr>
+                <w:rFonts w:ascii="Arial" w:hAnsi="Arial"/>
+                <w:b/>
+                <w:i w:val="0"/>
+                <w:color w:val="008C8C"/>
+                <w:sz w:val="30"/>
+              </w:rPr>
+              <w:t>26.7%</w:t>
+            </w:r>
+          </w:p>
+          <w:p>
+            <w:pPr>
+              <w:spacing w:after="0"/>
+              <w:jc w:val="center"/>
+            </w:pPr>
+            <w:r>
+              <w:rPr>
+                <w:rFonts w:ascii="Arial" w:hAnsi="Arial"/>
+                <w:b w:val="0"/>
+                <w:i w:val="0"/>
+                <w:color w:val="5E6C76"/>
+                <w:sz w:val="15"/>
+              </w:rPr>
+              <w:t>all comparable revenue from BTP</w:t>
             </w:r>
           </w:p>
         </w:tc>
@@ -200,97 +290,7 @@
                 <w:color w:val="5E6C76"/>
                 <w:sz w:val="15"/>
               </w:rPr>
-              <w:t>revenue in 3 complete months</w:t>
-            </w:r>
-          </w:p>
-        </w:tc>
-        <w:tc>
-          <w:tcPr>
-            <w:tcW w:type="dxa" w:w="2622"/>
-            <w:shd w:fill="F3F5F7"/>
-            <w:tcMar>
-              <w:top w:w="90" w:type="dxa"/>
-              <w:start w:w="65" w:type="dxa"/>
-              <w:bottom w:w="90" w:type="dxa"/>
-              <w:end w:w="65" w:type="dxa"/>
-            </w:tcMar>
-            <w:vAlign w:val="center"/>
-          </w:tcPr>
-          <w:p>
-            <w:pPr>
-              <w:spacing w:after="0"/>
-              <w:jc w:val="center"/>
-            </w:pPr>
-            <w:r>
-              <w:rPr>
-                <w:rFonts w:ascii="Arial" w:hAnsi="Arial"/>
-                <w:b/>
-                <w:i w:val="0"/>
-                <w:color w:val="008C8C"/>
-                <w:sz w:val="30"/>
-              </w:rPr>
-              <w:t>30.3%</w:t>
-            </w:r>
-          </w:p>
-          <w:p>
-            <w:pPr>
-              <w:spacing w:after="0"/>
-              <w:jc w:val="center"/>
-            </w:pPr>
-            <w:r>
-              <w:rPr>
-                <w:rFonts w:ascii="Arial" w:hAnsi="Arial"/>
-                <w:b w:val="0"/>
-                <w:i w:val="0"/>
-                <w:color w:val="5E6C76"/>
-                <w:sz w:val="15"/>
-              </w:rPr>
-              <w:t>high-value revenue from BTP</w:t>
-            </w:r>
-          </w:p>
-        </w:tc>
-        <w:tc>
-          <w:tcPr>
-            <w:tcW w:type="dxa" w:w="2622"/>
-            <w:shd w:fill="EAF4F4"/>
-            <w:tcMar>
-              <w:top w:w="90" w:type="dxa"/>
-              <w:start w:w="65" w:type="dxa"/>
-              <w:bottom w:w="90" w:type="dxa"/>
-              <w:end w:w="65" w:type="dxa"/>
-            </w:tcMar>
-            <w:vAlign w:val="center"/>
-          </w:tcPr>
-          <w:p>
-            <w:pPr>
-              <w:spacing w:after="0"/>
-              <w:jc w:val="center"/>
-            </w:pPr>
-            <w:r>
-              <w:rPr>
-                <w:rFonts w:ascii="Arial" w:hAnsi="Arial"/>
-                <w:b/>
-                <w:i w:val="0"/>
-                <w:color w:val="008C8C"/>
-                <w:sz w:val="30"/>
-              </w:rPr>
-              <w:t>2.18×</w:t>
-            </w:r>
-          </w:p>
-          <w:p>
-            <w:pPr>
-              <w:spacing w:after="0"/>
-              <w:jc w:val="center"/>
-            </w:pPr>
-            <w:r>
-              <w:rPr>
-                <w:rFonts w:ascii="Arial" w:hAnsi="Arial"/>
-                <w:b w:val="0"/>
-                <w:i w:val="0"/>
-                <w:color w:val="5E6C76"/>
-                <w:sz w:val="15"/>
-              </w:rPr>
-              <w:t>Plus representation in high value</w:t>
+              <w:t>generated by top 20% — secondary</w:t>
             </w:r>
           </w:p>
         </w:tc>
@@ -457,7 +457,7 @@
                 <w:color w:val="17212B"/>
                 <w:sz w:val="17"/>
               </w:rPr>
-              <w:t>BTP leads scalable persona value: 30.28% of high-value revenue and 1.47× represented.</w:t>
+              <w:t>BTP leads persona scale and efficiency: 26.74% of all revenue and 1.48× average revenue/company.</w:t>
             </w:r>
           </w:p>
           <w:p>
@@ -472,7 +472,7 @@
                 <w:color w:val="17212B"/>
                 <w:sz w:val="16"/>
               </w:rPr>
-              <w:t>Plus combines scale with efficiency: 33.42% of high-value revenue and 2.18× represented.</w:t>
+              <w:t>Plus contributes 28.56% of all plan revenue at 2.02× average revenue/company.</w:t>
             </w:r>
           </w:p>
         </w:tc>
@@ -515,7 +515,7 @@
                 <w:color w:val="17212B"/>
                 <w:sz w:val="17"/>
               </w:rPr>
-              <w:t>Business is 3.55× represented but has only 196 comparable companies.</w:t>
+              <w:t>Business reaches 3.22× average revenue/company but contributes only 6.95% of revenue (N=196).</w:t>
             </w:r>
           </w:p>
           <w:p>
@@ -530,7 +530,7 @@
                 <w:color w:val="17212B"/>
                 <w:sz w:val="16"/>
               </w:rPr>
-              <w:t>Start contributes the most high-value revenue (39.70%) but is proportional at 0.97×; scale and efficiency are different.</w:t>
+              <w:t>Start contributes the most revenue (44.64%) through scale, at approximately average revenue/company (1.01×).</w:t>
             </w:r>
           </w:p>
         </w:tc>
@@ -603,7 +603,7 @@
                 <w:color w:val="5E6C76"/>
                 <w:sz w:val="15"/>
               </w:rPr>
-              <w:t>share of all high-value revenue; this captures absolute scale</w:t>
+              <w:t>share of revenue across the complete 9,088-company base</w:t>
             </w:r>
           </w:p>
         </w:tc>
@@ -639,7 +639,7 @@
                 <w:color w:val="5E6C76"/>
                 <w:sz w:val="15"/>
               </w:rPr>
-              <w:t>representation versus base; teal means at least 1.2×</w:t>
+              <w:t>average revenue/company versus overall; teal means at least 1.2×</w:t>
             </w:r>
           </w:p>
         </w:tc>
@@ -741,7 +741,7 @@
           <w:color w:val="17212B"/>
           <w:sz w:val="18"/>
         </w:rPr>
-        <w:t>prioritize a controlled BTP adoption test, with Plus as the strongest plan signal. Do not mistake Business efficiency or Start scale for a complete recommendation on its own.</w:t>
+        <w:t>prioritize a controlled BTP adoption test, with Plus as the strongest scalable plan signal. Treat the 70/20 result as concentration context, not the segment selection rule.</w:t>
       </w:r>
     </w:p>
     <w:p>
@@ -925,7 +925,7 @@
                 <w:color w:val="17212B"/>
                 <w:sz w:val="16"/>
               </w:rPr>
-              <w:t>BTP contributes 30.28% of high-value revenue (N=1,642; 1.47×). In the mature BTP base (N=1,151), 71.07% are Healthy and 15.55% Watch.</w:t>
+              <w:t>BTP contributes 26.74% of all comparable revenue (N=1,642; €178.85/company; 1.48× overall). In the mature BTP base, 71.07% are Healthy and 15.55% Watch.</w:t>
             </w:r>
           </w:p>
         </w:tc>

</xml_diff>

<commit_message>
Add external market research and revised strategy document for Shine France
- Created a new Word document detailing external market research and revised strategy for Shine in France, focusing on BTP scalability and competitive analysis.
- Implemented functions to build the document structure, including title, decision box, evidence tables, and source lines.
- Added hyperlinks for external references and sources throughout the document.
- Updated the document generation script to include new content and formatting for improved readability and presentation.
</commit_message>
<xml_diff>
--- a/Shine_Case_3_Page_Memo.docx
+++ b/Shine_Case_3_Page_Memo.docx
@@ -30,7 +30,7 @@
           <w:color w:val="102A43"/>
           <w:sz w:val="40"/>
         </w:rPr>
-        <w:t>Segment rankings point to BTP and Plus—not one universal winner</w:t>
+        <w:t>BTP is the strongest demonstrated vertical—not unlimited market headroom</w:t>
       </w:r>
     </w:p>
     <w:p>
@@ -82,7 +82,7 @@
                 <w:color w:val="FFFFFF"/>
                 <w:sz w:val="22"/>
               </w:rPr>
-              <w:t>Across all 9,088 comparable companies, BTP contributes 26.74% of revenue and Start 44.64% by plan; Plus generates 2.02× average revenue per company. Separately, the top 20% generates 70.24%—a concentration signal, not the segment-ranking basis.</w:t>
+              <w:t>Across all 9,088 comparable companies, BTP contributes 26.74% of revenue and Plus generates 2.02× average revenue/company. External evidence supports BTP product fit, but sector and product constraints require a bounded causal test before scaling.</w:t>
             </w:r>
           </w:p>
         </w:tc>
@@ -457,7 +457,7 @@
                 <w:color w:val="17212B"/>
                 <w:sz w:val="17"/>
               </w:rPr>
-              <w:t>BTP leads persona scale and efficiency: 26.74% of all revenue and 1.48× average revenue/company.</w:t>
+              <w:t>BTP leads demonstrated persona scale and efficiency: 26.74% of revenue and 1.48× average revenue/company.</w:t>
             </w:r>
           </w:p>
           <w:p>
@@ -472,7 +472,7 @@
                 <w:color w:val="17212B"/>
                 <w:sz w:val="16"/>
               </w:rPr>
-              <w:t>Plus contributes 28.56% of all plan revenue at 2.02× average revenue/company.</w:t>
+              <w:t>France has a large artisan BTP base; Shine already offers a dedicated BTP workflow.</w:t>
             </w:r>
           </w:p>
         </w:tc>
@@ -515,7 +515,7 @@
                 <w:color w:val="17212B"/>
                 <w:sz w:val="17"/>
               </w:rPr>
-              <w:t>Business reaches 3.22× average revenue/company but contributes only 6.95% of revenue (N=196).</w:t>
+              <w:t>BTP activity contracted in 2025; Shine cannot directly offer overdrafts and advanced BTP invoicing is only partly supported.</w:t>
             </w:r>
           </w:p>
           <w:p>
@@ -530,7 +530,7 @@
                 <w:color w:val="17212B"/>
                 <w:sz w:val="16"/>
               </w:rPr>
-              <w:t>Start contributes the most revenue (44.64%) through scale, at approximately average revenue/company (1.01×).</w:t>
+              <w:t>Business reaches 3.22× average revenue/company but contributes only 6.95% (N=196); it is not the lead bet.</w:t>
             </w:r>
           </w:p>
         </w:tc>
@@ -741,7 +741,7 @@
           <w:color w:val="17212B"/>
           <w:sz w:val="18"/>
         </w:rPr>
-        <w:t>prioritize a controlled BTP adoption test, with Plus as the strongest scalable plan signal. Treat the 70/20 result as concentration context, not the segment selection rule.</w:t>
+        <w:t>prioritize a controlled BTP-fit activation test, with Plus as the strongest initial-plan signal. Scale only on incremental contribution; treat 70/20 as secondary concentration context.</w:t>
       </w:r>
     </w:p>
     <w:p>
@@ -868,7 +868,7 @@
                 <w:color w:val="102A43"/>
                 <w:sz w:val="18"/>
               </w:rPr>
-              <w:t>BTP adoption &amp; monetization experiment</w:t>
+              <w:t>BTP-fit activation &amp; monetization experiment</w:t>
             </w:r>
           </w:p>
           <w:p>
@@ -883,7 +883,7 @@
                 <w:color w:val="5E6C76"/>
                 <w:sz w:val="15"/>
               </w:rPr>
-              <w:t>Replicate the product behaviors associated with high value; do not assume plan upsell is the lever.</w:t>
+              <w:t>Test a vertical workflow with suitable tradespeople and small crews; do not assume broad BTP acquisition or plan upsell is the lever.</w:t>
             </w:r>
           </w:p>
         </w:tc>
@@ -967,7 +967,7 @@
                 <w:color w:val="17212B"/>
                 <w:sz w:val="16"/>
               </w:rPr>
-              <w:t>No current plan, product-use, cost, or margin data. Uplift cannot be sized in euros before a causal test.</w:t>
+              <w:t>Existing BTP targeting, sector contraction, financing needs, and product limits cap extrapolation. No CAC, margin, current-plan, or product-use data.</w:t>
             </w:r>
           </w:p>
         </w:tc>
@@ -1163,6 +1163,101 @@
     </w:p>
     <w:p>
       <w:pPr>
+        <w:spacing w:before="20" w:after="20"/>
+      </w:pPr>
+      <w:r>
+        <w:rPr>
+          <w:rFonts w:ascii="Arial" w:hAnsi="Arial"/>
+          <w:b/>
+          <w:i w:val="0"/>
+          <w:color w:val="008C8C"/>
+          <w:sz w:val="14"/>
+        </w:rPr>
+        <w:t xml:space="preserve">External pressure test: </w:t>
+      </w:r>
+      <w:r>
+        <w:rPr>
+          <w:rFonts w:ascii="Arial" w:hAnsi="Arial"/>
+          <w:b w:val="0"/>
+          <w:i w:val="0"/>
+          <w:color w:val="5E6C76"/>
+          <w:sz w:val="14"/>
+        </w:rPr>
+        <w:t xml:space="preserve">large artisan base and a dedicated Shine offer support fit; BTP contraction, no direct overdraft, and advanced invoicing limits narrow the ideal customer. </w:t>
+      </w:r>
+      <w:hyperlink r:id="rId11">
+        <w:r>
+          <w:rPr>
+            <w:color w:val="008C8C"/>
+            <w:u w:val="single"/>
+            <w:sz w:val="14"/>
+          </w:rPr>
+          <w:t>INSEE</w:t>
+        </w:r>
+      </w:hyperlink>
+      <w:r>
+        <w:rPr>
+          <w:rFonts w:ascii="Arial" w:hAnsi="Arial"/>
+          <w:b w:val="0"/>
+          <w:i w:val="0"/>
+          <w:color w:val="5E6C76"/>
+          <w:sz w:val="14"/>
+        </w:rPr>
+        <w:t xml:space="preserve"> • </w:t>
+      </w:r>
+      <w:hyperlink r:id="rId12">
+        <w:r>
+          <w:rPr>
+            <w:color w:val="008C8C"/>
+            <w:u w:val="single"/>
+            <w:sz w:val="14"/>
+          </w:rPr>
+          <w:t>Shine BTP</w:t>
+        </w:r>
+      </w:hyperlink>
+      <w:r>
+        <w:rPr>
+          <w:rFonts w:ascii="Arial" w:hAnsi="Arial"/>
+          <w:b w:val="0"/>
+          <w:i w:val="0"/>
+          <w:color w:val="5E6C76"/>
+          <w:sz w:val="14"/>
+        </w:rPr>
+        <w:t xml:space="preserve"> • </w:t>
+      </w:r>
+      <w:hyperlink r:id="rId13">
+        <w:r>
+          <w:rPr>
+            <w:color w:val="008C8C"/>
+            <w:u w:val="single"/>
+            <w:sz w:val="14"/>
+          </w:rPr>
+          <w:t>CAPEB</w:t>
+        </w:r>
+      </w:hyperlink>
+      <w:r>
+        <w:rPr>
+          <w:rFonts w:ascii="Arial" w:hAnsi="Arial"/>
+          <w:b w:val="0"/>
+          <w:i w:val="0"/>
+          <w:color w:val="5E6C76"/>
+          <w:sz w:val="14"/>
+        </w:rPr>
+        <w:t xml:space="preserve"> • </w:t>
+      </w:r>
+      <w:hyperlink r:id="rId14">
+        <w:r>
+          <w:rPr>
+            <w:color w:val="008C8C"/>
+            <w:u w:val="single"/>
+            <w:sz w:val="14"/>
+          </w:rPr>
+          <w:t>Product limits</w:t>
+        </w:r>
+      </w:hyperlink>
+    </w:p>
+    <w:p>
+      <w:pPr>
         <w:keepNext/>
         <w:spacing w:before="40" w:after="60"/>
       </w:pPr>
@@ -1198,7 +1293,7 @@
                     <pic:cNvPicPr/>
                   </pic:nvPicPr>
                   <pic:blipFill>
-                    <a:blip r:embed="rId11"/>
+                    <a:blip r:embed="rId15"/>
                     <a:stretch>
                       <a:fillRect/>
                     </a:stretch>
@@ -1772,7 +1867,7 @@
           <w:color w:val="102A43"/>
           <w:sz w:val="21"/>
         </w:rPr>
-        <w:t>Lead experiment: BTP product adoption</w:t>
+        <w:t>Lead experiment: BTP-fit workflow activation</w:t>
       </w:r>
     </w:p>
     <w:tbl>
@@ -1849,7 +1944,7 @@
                 <w:color w:val="17212B"/>
                 <w:sz w:val="15"/>
               </w:rPr>
-              <w:t>A single, customer-appropriate product-adoption intervention causes incremental recognised revenue without worsening customer, operational, risk, or fairness outcomes.</w:t>
+              <w:t>A BTP-specific workflow around e-invoicing, collection, expense control, cash-flow signals, or relevant partner services causes incremental recognised revenue without worsening guardrails.</w:t>
             </w:r>
           </w:p>
         </w:tc>
@@ -1910,7 +2005,7 @@
                 <w:color w:val="17212B"/>
                 <w:sz w:val="15"/>
               </w:rPr>
-              <w:t>Freeze eligibility using a pre-period; use revenue-active BTP below a pre-defined high-value threshold; randomise treatment vs business-as-usual; stratify by pre-revenue, cohort age, current plan and usage; analyse intention-to-treat.</w:t>
+              <w:t>Use product need—not persona alone—to identify suitable tradespeople and small crews; freeze eligibility in a pre-period; randomise treatment vs business-as-usual; stratify by pre-revenue, cohort age, current plan and usage; analyse intention-to-treat.</w:t>
             </w:r>
           </w:p>
         </w:tc>
@@ -2032,7 +2127,7 @@
                 <w:color w:val="17212B"/>
                 <w:sz w:val="15"/>
               </w:rPr>
-              <w:t>Scale only if the pre-registered interval supports positive uplift above fully loaded treatment cost, with no material guardrail deterioration. Power the test after final eligibility, cost and variance are known.</w:t>
+              <w:t>Scale within BTP only if the pre-registered interval supports uplift above fully loaded treatment cost with no guardrail deterioration. Test transferability separately before expanding to other personas.</w:t>
             </w:r>
           </w:p>
         </w:tc>
@@ -2220,7 +2315,7 @@
                 <w:color w:val="102A43"/>
                 <w:sz w:val="16"/>
               </w:rPr>
-              <w:t xml:space="preserve">  Business meaning</w:t>
+              <w:t xml:space="preserve">  Selection &amp; meaning</w:t>
             </w:r>
           </w:p>
           <w:p>
@@ -2235,7 +2330,7 @@
                 <w:color w:val="17212B"/>
                 <w:sz w:val="15"/>
               </w:rPr>
-              <w:t>Validate activation, closure, cancellation, revenue recognition, current plan and persona history.</w:t>
+              <w:t>Validate BTP definition, acquisition channel/spend, CAC, approval, current plan, persona history and product use.</w:t>
             </w:r>
           </w:p>
         </w:tc>
@@ -2676,6 +2771,91 @@
         <w:t>true churn, forecast LTV, causal plan effect, CAC/payback, profitability, or complete May performance.</w:t>
       </w:r>
     </w:p>
+    <w:p>
+      <w:pPr>
+        <w:spacing w:after="0"/>
+      </w:pPr>
+      <w:r>
+        <w:rPr>
+          <w:rFonts w:ascii="Arial" w:hAnsi="Arial"/>
+          <w:b/>
+          <w:i w:val="0"/>
+          <w:color w:val="008C8C"/>
+          <w:sz w:val="14"/>
+        </w:rPr>
+        <w:t xml:space="preserve">External sources: </w:t>
+      </w:r>
+      <w:hyperlink r:id="rId16">
+        <w:r>
+          <w:rPr>
+            <w:color w:val="008C8C"/>
+            <w:u w:val="single"/>
+            <w:sz w:val="14"/>
+          </w:rPr>
+          <w:t>Shine pricing</w:t>
+        </w:r>
+      </w:hyperlink>
+      <w:r>
+        <w:rPr>
+          <w:rFonts w:ascii="Arial" w:hAnsi="Arial"/>
+          <w:b w:val="0"/>
+          <w:i w:val="0"/>
+          <w:color w:val="5E6C76"/>
+          <w:sz w:val="14"/>
+        </w:rPr>
+        <w:t xml:space="preserve"> • </w:t>
+      </w:r>
+      <w:hyperlink r:id="rId17">
+        <w:r>
+          <w:rPr>
+            <w:color w:val="008C8C"/>
+            <w:u w:val="single"/>
+            <w:sz w:val="14"/>
+          </w:rPr>
+          <w:t>Overdraft policy</w:t>
+        </w:r>
+      </w:hyperlink>
+      <w:r>
+        <w:rPr>
+          <w:rFonts w:ascii="Arial" w:hAnsi="Arial"/>
+          <w:b w:val="0"/>
+          <w:i w:val="0"/>
+          <w:color w:val="5E6C76"/>
+          <w:sz w:val="14"/>
+        </w:rPr>
+        <w:t xml:space="preserve"> • </w:t>
+      </w:r>
+      <w:hyperlink r:id="rId18">
+        <w:r>
+          <w:rPr>
+            <w:color w:val="008C8C"/>
+            <w:u w:val="single"/>
+            <w:sz w:val="14"/>
+          </w:rPr>
+          <w:t>E-invoice reform</w:t>
+        </w:r>
+      </w:hyperlink>
+      <w:r>
+        <w:rPr>
+          <w:rFonts w:ascii="Arial" w:hAnsi="Arial"/>
+          <w:b w:val="0"/>
+          <w:i w:val="0"/>
+          <w:color w:val="5E6C76"/>
+          <w:sz w:val="14"/>
+        </w:rPr>
+        <w:t xml:space="preserve"> • </w:t>
+      </w:r>
+      <w:r>
+        <w:rPr>
+          <w:rFonts w:ascii="Arial" w:hAnsi="Arial"/>
+          <w:b w:val="0"/>
+          <w:i w:val="0"/>
+          <w:color w:val="5E6C76"/>
+          <w:sz w:val="14"/>
+        </w:rPr>
+        <w:t>full research note: SHINE_MARKET_RESEARCH_AND_STRATEGY.md</w:t>
+      </w:r>
+    </w:p>
     <w:sectPr>
       <w:footerReference w:type="default" r:id="rId9"/>
       <w:pgSz w:w="11906" w:h="16838"/>

</xml_diff>